<commit_message>
At home work, docs
</commit_message>
<xml_diff>
--- a/Working Documents/Timeline for Extension Request.docx
+++ b/Working Documents/Timeline for Extension Request.docx
@@ -244,19 +244,11 @@
                 <w:lang w:val="en-US"/>
               </w:rPr>
             </w:pPr>
-            <w:proofErr w:type="gramStart"/>
-            <w:r>
-              <w:rPr>
-                <w:lang w:val="en-US"/>
-              </w:rPr>
-              <w:t>Write</w:t>
-            </w:r>
-            <w:proofErr w:type="gramEnd"/>
-            <w:r>
-              <w:rPr>
-                <w:lang w:val="en-US"/>
-              </w:rPr>
-              <w:t xml:space="preserve"> Research Methods Chapters</w:t>
+            <w:r>
+              <w:rPr>
+                <w:lang w:val="en-US"/>
+              </w:rPr>
+              <w:t>Write Research Methods Chapters</w:t>
             </w:r>
           </w:p>
         </w:tc>

</xml_diff>